<commit_message>
No funcó mejora judicial
</commit_message>
<xml_diff>
--- a/Documentos/ITR — Mejoras (Actualización junio 2026).docx
+++ b/Documentos/ITR — Mejoras (Actualización junio 2026).docx
@@ -663,6 +663,236 @@
           <w:sz w:val="20"/>
         </w:rPr>
         <w:t xml:space="preserve">• Padrón vivo (la base es el dataset viejo): del cuerpo se extrae el juzgado/tribunal (y el concurso si figura) y se mapea al cargo del dataset oficial descargado. El propio bot aplica las actualizaciones EN VIVO sobre ese dataset: alta → marcar Titular (y bajar subrogancia/sin-cobertura del cargo); baja → marcar Vacante. Cada vez que sale un snapshot oficial nuevo, se reconcilia y el padrón se reinicia desde el dato duro.</w:t>
+      </w:r>
+    </w:p>
+    <w:p>
+      <w:pPr>
+        <w:spacing w:after="120" w:before="240" w:line="276" w:lineRule="auto"/>
+      </w:pPr>
+      <w:r>
+        <w:rPr>
+          <w:rFonts w:ascii="Open Sans" w:hAnsi="Open Sans" w:cs="Open Sans"/>
+          <w:b/>
+          <w:i w:val="0"/>
+          <w:color w:val="FF0000"/>
+          <w:sz w:val="26"/>
+        </w:rPr>
+        <w:t xml:space="preserve">F. mcp-legal-ar y usos futuros de fuentes jurídicas</w:t>
+      </w:r>
+    </w:p>
+    <w:p>
+      <w:pPr>
+        <w:spacing w:after="120" w:before="0" w:line="276" w:lineRule="auto"/>
+      </w:pPr>
+      <w:r>
+        <w:rPr>
+          <w:rFonts w:ascii="Open Sans" w:hAnsi="Open Sans" w:cs="Open Sans"/>
+          <w:b/>
+          <w:i w:val="0"/>
+          <w:color w:val="404040"/>
+          <w:sz w:val="20"/>
+        </w:rPr>
+        <w:t xml:space="preserve">Qué es: </w:t>
+      </w:r>
+      <w:r>
+        <w:rPr>
+          <w:rFonts w:ascii="Open Sans" w:hAnsi="Open Sans" w:cs="Open Sans"/>
+          <w:b w:val="0"/>
+          <w:i w:val="0"/>
+          <w:color w:val="404040"/>
+          <w:sz w:val="20"/>
+        </w:rPr>
+        <w:t xml:space="preserve">hub MCP (Probanza-ar) para Claude Desktop que unifica 11 fuentes jurídicas argentinas (BORA, InfoLEG, SAIJ, JUBA, SCBA, PJN jurisprudencia/consulta, PTN, TFN, BOPBA, Normativa PBA), solo lectura y local. NO alimenta el valor publicado del ITR (regla no-IA: el índice sale de scrapers determinísticos); sirve como capa de EXPLORACIÓN/verificación.</w:t>
+      </w:r>
+    </w:p>
+    <w:p>
+      <w:pPr>
+        <w:spacing w:after="120" w:before="0" w:line="276" w:lineRule="auto"/>
+      </w:pPr>
+      <w:r>
+        <w:rPr>
+          <w:rFonts w:ascii="Open Sans" w:hAnsi="Open Sans" w:cs="Open Sans"/>
+          <w:b/>
+          <w:i w:val="0"/>
+          <w:color w:val="404040"/>
+          <w:sz w:val="20"/>
+        </w:rPr>
+        <w:t xml:space="preserve">QA / verificación mensual (a evaluar): </w:t>
+      </w:r>
+      <w:r>
+        <w:rPr>
+          <w:rFonts w:ascii="Open Sans" w:hAnsi="Open Sans" w:cs="Open Sans"/>
+          <w:b w:val="0"/>
+          <w:i w:val="0"/>
+          <w:color w:val="404040"/>
+          <w:sz w:val="20"/>
+        </w:rPr>
+        <w:t xml:space="preserve">antes de publicar, chequear a mano un decreto/norma/expediente que marque un radar, o verificar anomalías del mes (p. ej. confirmar en InfoLEG el estado de una norma, o un fallo).</w:t>
+      </w:r>
+    </w:p>
+    <w:p>
+      <w:pPr>
+        <w:spacing w:after="120" w:before="0" w:line="276" w:lineRule="auto"/>
+      </w:pPr>
+      <w:r>
+        <w:rPr>
+          <w:rFonts w:ascii="Open Sans" w:hAnsi="Open Sans" w:cs="Open Sans"/>
+          <w:b/>
+          <w:i w:val="0"/>
+          <w:color w:val="404040"/>
+          <w:sz w:val="20"/>
+        </w:rPr>
+        <w:t xml:space="preserve">Investigación de fuentes (dos frentes): </w:t>
+      </w:r>
+      <w:r>
+        <w:rPr>
+          <w:rFonts w:ascii="Open Sans" w:hAnsi="Open Sans" w:cs="Open Sans"/>
+          <w:b w:val="0"/>
+          <w:i w:val="0"/>
+          <w:color w:val="404040"/>
+          <w:sz w:val="20"/>
+        </w:rPr>
+        <w:t xml:space="preserve">(a) evaluar ESTIRAR EL HISTÓRICO a pre-2017 en variables que hoy arrancan tarde (BORA desde 1938; InfoLEG y SAIJ tienen profundidad); (b) que el bot APRENDA de reclasificaciones / cambios de etiqueta de las fuentes (como el cambio de etiqueta del ATN) para anticipar cambios de esquema futuros.</w:t>
+      </w:r>
+    </w:p>
+    <w:p>
+      <w:pPr>
+        <w:spacing w:after="120" w:before="0" w:line="276" w:lineRule="auto"/>
+      </w:pPr>
+      <w:r>
+        <w:rPr>
+          <w:rFonts w:ascii="Open Sans" w:hAnsi="Open Sans" w:cs="Open Sans"/>
+          <w:b/>
+          <w:i w:val="0"/>
+          <w:color w:val="404040"/>
+          <w:sz w:val="20"/>
+        </w:rPr>
+        <w:t xml:space="preserve">Radar de eventos institucionales (parqueado): </w:t>
+      </w:r>
+      <w:r>
+        <w:rPr>
+          <w:rFonts w:ascii="Open Sans" w:hAnsi="Open Sans" w:cs="Open Sans"/>
+          <w:b w:val="0"/>
+          <w:i w:val="0"/>
+          <w:color w:val="404040"/>
+          <w:sz w:val="20"/>
+        </w:rPr>
+        <w:t xml:space="preserve">el radar DETECTA y emite una ALERTA COMPUESTA que explica el hecho y en qué variable aplicaría; NUNCA aplica solo. El operador humano decide si entra, con qué ponderación y cuánto efecto. Feeds posibles: BORA/SAIJ/PJN.</w:t>
+      </w:r>
+    </w:p>
+    <w:p>
+      <w:pPr>
+        <w:spacing w:after="120" w:before="160" w:line="276" w:lineRule="auto"/>
+      </w:pPr>
+      <w:r>
+        <w:rPr>
+          <w:rFonts w:ascii="Open Sans" w:hAnsi="Open Sans" w:cs="Open Sans"/>
+          <w:b/>
+          <w:i w:val="0"/>
+          <w:color w:val="404040"/>
+          <w:sz w:val="20"/>
+        </w:rPr>
+        <w:t xml:space="preserve">Variable JUDICIAL — alternativas a evaluar (es la más floja del índice):</w:t>
+      </w:r>
+    </w:p>
+    <w:p>
+      <w:pPr>
+        <w:spacing w:after="60" w:before="0" w:line="276" w:lineRule="auto"/>
+      </w:pPr>
+      <w:r>
+        <w:rPr>
+          <w:rFonts w:ascii="Open Sans" w:hAnsi="Open Sans" w:cs="Open Sans"/>
+          <w:b w:val="0"/>
+          <w:i w:val="0"/>
+          <w:color w:val="404040"/>
+          <w:sz w:val="20"/>
+        </w:rPr>
+        <w:t xml:space="preserve">• Duración de subrogancias/vacancias: DESCARTADO. El único campo con cobertura (concurso_ambito_fecha_ingreso, 98%) mide hace cuánto el concurso está abierto SIN resolverse, lo que MEZCLA al Consejo (sustanciar) con el Ejecutivo+Senado (designar). Llenar la vacante no es atributo de calidad del Poder Judicial (depende de negociación política y del Ejecutivo). Sin la fecha de declaración de la vacante no se puede aislar el tiempo que controla el Poder Judicial. No sirve.</w:t>
+      </w:r>
+    </w:p>
+    <w:p>
+      <w:pPr>
+        <w:spacing w:after="60" w:before="0" w:line="276" w:lineRule="auto"/>
+      </w:pPr>
+      <w:r>
+        <w:rPr>
+          <w:rFonts w:ascii="Open Sans" w:hAnsi="Open Sans" w:cs="Open Sans"/>
+          <w:b w:val="0"/>
+          <w:i w:val="0"/>
+          <w:color w:val="404040"/>
+          <w:sz w:val="20"/>
+        </w:rPr>
+        <w:t xml:space="preserve">• Consejo de la Magistratura: INVESTIGADO (jun-2026) → NO VIABLE. El dataset de datos.jus «Selección de magistrados / concursos» trae fecha_publicacion_concurso (apertura) pero NO la fecha de declaración de la vacante, así que no se puede aislar el «tiempo en abrir» (lo único atribuible al Consejo). Además su frecuencia es «Eventual» (mismo dataset lento que magistrados). Falla las dos condiciones → no se construye. Disciplina/sanciones tampoco (ambigua).</w:t>
+      </w:r>
+    </w:p>
+    <w:p>
+      <w:pPr>
+        <w:spacing w:after="60" w:before="0" w:line="276" w:lineRule="auto"/>
+      </w:pPr>
+      <w:r>
+        <w:rPr>
+          <w:rFonts w:ascii="Open Sans" w:hAnsi="Open Sans" w:cs="Open Sans"/>
+          <w:b w:val="0"/>
+          <w:i w:val="0"/>
+          <w:color w:val="404040"/>
+          <w:sz w:val="20"/>
+        </w:rPr>
+        <w:t xml:space="preserve">• Pliegos pendientes en el Senado: DESCARTADO — más político que institucional (atribuye la traba al Senado) y redundante con la duración de vacancia.</w:t>
+      </w:r>
+    </w:p>
+    <w:p>
+      <w:pPr>
+        <w:spacing w:after="60" w:before="0" w:line="276" w:lineRule="auto"/>
+      </w:pPr>
+      <w:r>
+        <w:rPr>
+          <w:rFonts w:ascii="Open Sans" w:hAnsi="Open Sans" w:cs="Open Sans"/>
+          <w:b w:val="0"/>
+          <w:i w:val="0"/>
+          <w:color w:val="404040"/>
+          <w:sz w:val="20"/>
+        </w:rPr>
+        <w:t xml:space="preserve">• Cheques al Ejecutivo (cautelares/fallos contra el Estado): DESCARTADO como valor — terreno ambiguo: en un proceso de reforma una cautelar contra el Estado puede defender un interés sectorial y no proteger un derecho; separar interés genuino de partidario no es objetivable.</w:t>
+      </w:r>
+    </w:p>
+    <w:p>
+      <w:pPr>
+        <w:spacing w:after="60" w:before="0" w:line="276" w:lineRule="auto"/>
+      </w:pPr>
+      <w:r>
+        <w:rPr>
+          <w:rFonts w:ascii="Open Sans" w:hAnsi="Open Sans" w:cs="Open Sans"/>
+          <w:b w:val="0"/>
+          <w:i w:val="0"/>
+          <w:color w:val="404040"/>
+          <w:sz w:val="20"/>
+        </w:rPr>
+        <w:t xml:space="preserve">• Transparencia judicial (publicación de sentencias / datos abiertos). Determinístico MEDIO.</w:t>
+      </w:r>
+    </w:p>
+    <w:p>
+      <w:pPr>
+        <w:spacing w:after="120" w:before="160" w:line="276" w:lineRule="auto"/>
+      </w:pPr>
+      <w:r>
+        <w:rPr>
+          <w:rFonts w:ascii="Open Sans" w:hAnsi="Open Sans" w:cs="Open Sans"/>
+          <w:b/>
+          <w:i w:val="0"/>
+          <w:color w:val="404040"/>
+          <w:sz w:val="20"/>
+        </w:rPr>
+        <w:t xml:space="preserve">Conclusión (jun-2026): </w:t>
+      </w:r>
+      <w:r>
+        <w:rPr>
+          <w:rFonts w:ascii="Open Sans" w:hAnsi="Open Sans" w:cs="Open Sans"/>
+          <w:b w:val="0"/>
+          <w:i w:val="0"/>
+          <w:color w:val="404040"/>
+          <w:sz w:val="20"/>
+        </w:rPr>
+        <w:t xml:space="preserve">bajo el criterio de contar SOLO lo que controla el Poder Judicial, hoy no hay dato duro que refuerce la variable. El eje Judicial queda COMO ESTÁ (Desempeño de la Corte + Cobertura Judicial, que mide el ESTADO de independencia, válido aunque la causa del retraso sea del Ejecutivo). Es la pata más floja del índice, pero no se le agregan métricas que confundan responsabilidades ni que dependan de datasets poco confiables. Revisitar SOLO si el Consejo publica la fecha de declaración de la vacante de forma periódica, o si mejora la estadística de la CSJN. Transparencia judicial queda como única opción no cerrada, a explorar.</w:t>
       </w:r>
     </w:p>
     <w:p>

</xml_diff>